<commit_message>
Started new Project/Solution, added CMV files, and coded table classes
</commit_message>
<xml_diff>
--- a/12TPI Project Write-Up.docx
+++ b/12TPI Project Write-Up.docx
@@ -1,6 +1,6 @@
 
 <file path=word/document.xml><?xml version="1.0" encoding="utf-8"?>
-<w:document xmlns:wpc="http://schemas.microsoft.com/office/word/2010/wordprocessingCanvas" xmlns:cx="http://schemas.microsoft.com/office/drawing/2014/chartex" xmlns:cx1="http://schemas.microsoft.com/office/drawing/2015/9/8/chartex" xmlns:cx2="http://schemas.microsoft.com/office/drawing/2015/10/21/chartex" xmlns:cx3="http://schemas.microsoft.com/office/drawing/2016/5/9/chartex" xmlns:cx4="http://schemas.microsoft.com/office/drawing/2016/5/10/chartex" xmlns:cx5="http://schemas.microsoft.com/office/drawing/2016/5/11/chartex" xmlns:cx6="http://schemas.microsoft.com/office/drawing/2016/5/12/chartex" xmlns:cx7="http://schemas.microsoft.com/office/drawing/2016/5/13/chartex" xmlns:cx8="http://schemas.microsoft.com/office/drawing/2016/5/14/chartex" xmlns:mc="http://schemas.openxmlformats.org/markup-compatibility/2006" xmlns:aink="http://schemas.microsoft.com/office/drawing/2016/ink" xmlns:am3d="http://schemas.microsoft.com/office/drawing/2017/model3d" xmlns:o="urn:schemas-microsoft-com:office:office" xmlns:oel="http://schemas.microsoft.com/office/2019/extlst" xmlns:r="http://schemas.openxmlformats.org/officeDocument/2006/relationships" xmlns:m="http://schemas.openxmlformats.org/officeDocument/2006/math" xmlns:v="urn:schemas-microsoft-com:vml" xmlns:wp14="http://schemas.microsoft.com/office/word/2010/wordprocessingDrawing" xmlns:wp="http://schemas.openxmlformats.org/drawingml/2006/wordprocessingDrawing" xmlns:w10="urn:schemas-microsoft-com:office:word" xmlns:w="http://schemas.openxmlformats.org/wordprocessingml/2006/main" xmlns:w14="http://schemas.microsoft.com/office/word/2010/wordml" xmlns:w15="http://schemas.microsoft.com/office/word/2012/wordml" xmlns:w16cex="http://schemas.microsoft.com/office/word/2018/wordml/cex" xmlns:w16cid="http://schemas.microsoft.com/office/word/2016/wordml/cid" xmlns:w16="http://schemas.microsoft.com/office/word/2018/wordml" xmlns:w16du="http://schemas.microsoft.com/office/word/2023/wordml/word16du" xmlns:w16sdtdh="http://schemas.microsoft.com/office/word/2020/wordml/sdtdatahash" xmlns:w16sdtfl="http://schemas.microsoft.com/office/word/2024/wordml/sdtformatlock" xmlns:w16se="http://schemas.microsoft.com/office/word/2015/wordml/symex" xmlns:wpg="http://schemas.microsoft.com/office/word/2010/wordprocessingGroup" xmlns:wpi="http://schemas.microsoft.com/office/word/2010/wordprocessingInk" xmlns:wne="http://schemas.microsoft.com/office/word/2006/wordml" xmlns:wps="http://schemas.microsoft.com/office/word/2010/wordprocessingShape" mc:Ignorable="w14 w15 w16se w16cid w16 w16cex w16sdtdh w16sdtfl w16du wp14">
+<w:document xmlns:wpc="http://schemas.microsoft.com/office/word/2010/wordprocessingCanvas" xmlns:cx="http://schemas.microsoft.com/office/drawing/2014/chartex" xmlns:cx1="http://schemas.microsoft.com/office/drawing/2015/9/8/chartex" xmlns:cx2="http://schemas.microsoft.com/office/drawing/2015/10/21/chartex" xmlns:cx3="http://schemas.microsoft.com/office/drawing/2016/5/9/chartex" xmlns:cx4="http://schemas.microsoft.com/office/drawing/2016/5/10/chartex" xmlns:cx5="http://schemas.microsoft.com/office/drawing/2016/5/11/chartex" xmlns:cx6="http://schemas.microsoft.com/office/drawing/2016/5/12/chartex" xmlns:cx7="http://schemas.microsoft.com/office/drawing/2016/5/13/chartex" xmlns:cx8="http://schemas.microsoft.com/office/drawing/2016/5/14/chartex" xmlns:mc="http://schemas.openxmlformats.org/markup-compatibility/2006" xmlns:aink="http://schemas.microsoft.com/office/drawing/2016/ink" xmlns:am3d="http://schemas.microsoft.com/office/drawing/2017/model3d" xmlns:o="urn:schemas-microsoft-com:office:office" xmlns:oel="http://schemas.microsoft.com/office/2019/extlst" xmlns:r="http://schemas.openxmlformats.org/officeDocument/2006/relationships" xmlns:m="http://schemas.openxmlformats.org/officeDocument/2006/math" xmlns:v="urn:schemas-microsoft-com:vml" xmlns:wp14="http://schemas.microsoft.com/office/word/2010/wordprocessingDrawing" xmlns:wp="http://schemas.openxmlformats.org/drawingml/2006/wordprocessingDrawing" xmlns:w10="urn:schemas-microsoft-com:office:word" xmlns:w="http://schemas.openxmlformats.org/wordprocessingml/2006/main" xmlns:w14="http://schemas.microsoft.com/office/word/2010/wordml" xmlns:w15="http://schemas.microsoft.com/office/word/2012/wordml" xmlns:w16cex="http://schemas.microsoft.com/office/word/2018/wordml/cex" xmlns:w16cid="http://schemas.microsoft.com/office/word/2016/wordml/cid" xmlns:w16="http://schemas.microsoft.com/office/word/2018/wordml" xmlns:w16sdtdh="http://schemas.microsoft.com/office/word/2020/wordml/sdtdatahash" xmlns:w16se="http://schemas.microsoft.com/office/word/2015/wordml/symex" xmlns:wpg="http://schemas.microsoft.com/office/word/2010/wordprocessingGroup" xmlns:wpi="http://schemas.microsoft.com/office/word/2010/wordprocessingInk" xmlns:wne="http://schemas.microsoft.com/office/word/2006/wordml" xmlns:wps="http://schemas.microsoft.com/office/word/2010/wordprocessingShape" mc:Ignorable="w14 w15 w16se w16cid w16 w16cex w16sdtdh wp14">
   <w:body>
     <w:p>
       <w:pPr>
@@ -3240,6 +3240,7 @@
       </w:pPr>
       <w:r>
         <w:rPr>
+          <w:noProof/>
           <w:lang w:val="en-NZ" w:eastAsia="en-NZ"/>
         </w:rPr>
         <w:drawing>
@@ -3378,9 +3379,8 @@
           <w:szCs w:val="24"/>
           <w:lang w:val="en-NZ" w:eastAsia="en-NZ"/>
         </w:rPr>
-        <w:t xml:space="preserve">Old employees </w:t>
-      </w:r>
-      <w:proofErr w:type="gramStart"/>
+        <w:t xml:space="preserve">Old employees have to be trained to use the new system </w:t>
+      </w:r>
       <w:r>
         <w:rPr>
           <w:rFonts w:eastAsia="Times New Roman" w:cstheme="minorHAnsi"/>
@@ -3389,9 +3389,9 @@
           <w:szCs w:val="24"/>
           <w:lang w:val="en-NZ" w:eastAsia="en-NZ"/>
         </w:rPr>
-        <w:t>have to</w:t>
-      </w:r>
-      <w:proofErr w:type="gramEnd"/>
+        <w:t xml:space="preserve">– therefore halting the usage of the system and cost due to having to pay employees during </w:t>
+      </w:r>
+      <w:proofErr w:type="gramStart"/>
       <w:r>
         <w:rPr>
           <w:rFonts w:eastAsia="Times New Roman" w:cstheme="minorHAnsi"/>
@@ -3400,28 +3400,9 @@
           <w:szCs w:val="24"/>
           <w:lang w:val="en-NZ" w:eastAsia="en-NZ"/>
         </w:rPr>
-        <w:t xml:space="preserve"> be trained to use the new system </w:t>
-      </w:r>
-      <w:r>
-        <w:rPr>
-          <w:rFonts w:eastAsia="Times New Roman" w:cstheme="minorHAnsi"/>
-          <w:color w:val="2F5496" w:themeColor="accent1" w:themeShade="BF"/>
-          <w:sz w:val="24"/>
-          <w:szCs w:val="24"/>
-          <w:lang w:val="en-NZ" w:eastAsia="en-NZ"/>
-        </w:rPr>
-        <w:t xml:space="preserve">– therefore halting the usage of the system and cost due to having to pay employees during </w:t>
-      </w:r>
-      <w:r>
-        <w:rPr>
-          <w:rFonts w:eastAsia="Times New Roman" w:cstheme="minorHAnsi"/>
-          <w:color w:val="2F5496" w:themeColor="accent1" w:themeShade="BF"/>
-          <w:sz w:val="24"/>
-          <w:szCs w:val="24"/>
-          <w:lang w:val="en-NZ" w:eastAsia="en-NZ"/>
-        </w:rPr>
         <w:t>training</w:t>
       </w:r>
+      <w:proofErr w:type="gramEnd"/>
     </w:p>
     <w:p>
       <w:pPr>
@@ -3858,6 +3839,7 @@
           <w:rFonts w:eastAsia="Times New Roman"/>
           <w:lang w:val="en-NZ" w:eastAsia="en-NZ"/>
         </w:rPr>
+        <w:lastRenderedPageBreak/>
         <w:t>Class</w:t>
       </w:r>
       <w:r>
@@ -3882,6 +3864,55 @@
           <w:lang w:val="en-NZ" w:eastAsia="en-NZ"/>
         </w:rPr>
       </w:pPr>
+      <w:r>
+        <w:rPr>
+          <w:rFonts w:eastAsia="Times New Roman"/>
+          <w:noProof/>
+          <w:sz w:val="44"/>
+          <w:lang w:val="en-NZ" w:eastAsia="en-NZ"/>
+        </w:rPr>
+        <w:drawing>
+          <wp:inline distT="0" distB="0" distL="0" distR="0" wp14:anchorId="61EFD73B" wp14:editId="3FF8780D">
+            <wp:extent cx="4740348" cy="8045450"/>
+            <wp:effectExtent l="0" t="0" r="3175" b="0"/>
+            <wp:docPr id="531836629" name="Picture 1" descr="A screenshot of a computer&#10;&#10;AI-generated content may be incorrect."/>
+            <wp:cNvGraphicFramePr>
+              <a:graphicFrameLocks xmlns:a="http://schemas.openxmlformats.org/drawingml/2006/main" noChangeAspect="1"/>
+            </wp:cNvGraphicFramePr>
+            <a:graphic xmlns:a="http://schemas.openxmlformats.org/drawingml/2006/main">
+              <a:graphicData uri="http://schemas.openxmlformats.org/drawingml/2006/picture">
+                <pic:pic xmlns:pic="http://schemas.openxmlformats.org/drawingml/2006/picture">
+                  <pic:nvPicPr>
+                    <pic:cNvPr id="531836629" name="Picture 1" descr="A screenshot of a computer&#10;&#10;AI-generated content may be incorrect."/>
+                    <pic:cNvPicPr/>
+                  </pic:nvPicPr>
+                  <pic:blipFill>
+                    <a:blip r:embed="rId17">
+                      <a:extLst>
+                        <a:ext uri="{28A0092B-C50C-407E-A947-70E740481C1C}">
+                          <a14:useLocalDpi xmlns:a14="http://schemas.microsoft.com/office/drawing/2010/main" val="0"/>
+                        </a:ext>
+                      </a:extLst>
+                    </a:blip>
+                    <a:stretch>
+                      <a:fillRect/>
+                    </a:stretch>
+                  </pic:blipFill>
+                  <pic:spPr>
+                    <a:xfrm>
+                      <a:off x="0" y="0"/>
+                      <a:ext cx="4742934" cy="8049839"/>
+                    </a:xfrm>
+                    <a:prstGeom prst="rect">
+                      <a:avLst/>
+                    </a:prstGeom>
+                  </pic:spPr>
+                </pic:pic>
+              </a:graphicData>
+            </a:graphic>
+          </wp:inline>
+        </w:drawing>
+      </w:r>
       <w:r>
         <w:rPr>
           <w:rFonts w:eastAsia="Times New Roman"/>
@@ -4743,7 +4774,7 @@
 </file>
 
 <file path=word/endnotes.xml><?xml version="1.0" encoding="utf-8"?>
-<w:endnotes xmlns:wpc="http://schemas.microsoft.com/office/word/2010/wordprocessingCanvas" xmlns:cx="http://schemas.microsoft.com/office/drawing/2014/chartex" xmlns:cx1="http://schemas.microsoft.com/office/drawing/2015/9/8/chartex" xmlns:cx2="http://schemas.microsoft.com/office/drawing/2015/10/21/chartex" xmlns:cx3="http://schemas.microsoft.com/office/drawing/2016/5/9/chartex" xmlns:cx4="http://schemas.microsoft.com/office/drawing/2016/5/10/chartex" xmlns:cx5="http://schemas.microsoft.com/office/drawing/2016/5/11/chartex" xmlns:cx6="http://schemas.microsoft.com/office/drawing/2016/5/12/chartex" xmlns:cx7="http://schemas.microsoft.com/office/drawing/2016/5/13/chartex" xmlns:cx8="http://schemas.microsoft.com/office/drawing/2016/5/14/chartex" xmlns:mc="http://schemas.openxmlformats.org/markup-compatibility/2006" xmlns:aink="http://schemas.microsoft.com/office/drawing/2016/ink" xmlns:am3d="http://schemas.microsoft.com/office/drawing/2017/model3d" xmlns:o="urn:schemas-microsoft-com:office:office" xmlns:oel="http://schemas.microsoft.com/office/2019/extlst" xmlns:r="http://schemas.openxmlformats.org/officeDocument/2006/relationships" xmlns:m="http://schemas.openxmlformats.org/officeDocument/2006/math" xmlns:v="urn:schemas-microsoft-com:vml" xmlns:wp14="http://schemas.microsoft.com/office/word/2010/wordprocessingDrawing" xmlns:wp="http://schemas.openxmlformats.org/drawingml/2006/wordprocessingDrawing" xmlns:w10="urn:schemas-microsoft-com:office:word" xmlns:w="http://schemas.openxmlformats.org/wordprocessingml/2006/main" xmlns:w14="http://schemas.microsoft.com/office/word/2010/wordml" xmlns:w15="http://schemas.microsoft.com/office/word/2012/wordml" xmlns:w16cex="http://schemas.microsoft.com/office/word/2018/wordml/cex" xmlns:w16cid="http://schemas.microsoft.com/office/word/2016/wordml/cid" xmlns:w16="http://schemas.microsoft.com/office/word/2018/wordml" xmlns:w16du="http://schemas.microsoft.com/office/word/2023/wordml/word16du" xmlns:w16sdtdh="http://schemas.microsoft.com/office/word/2020/wordml/sdtdatahash" xmlns:w16sdtfl="http://schemas.microsoft.com/office/word/2024/wordml/sdtformatlock" xmlns:w16se="http://schemas.microsoft.com/office/word/2015/wordml/symex" xmlns:wpg="http://schemas.microsoft.com/office/word/2010/wordprocessingGroup" xmlns:wpi="http://schemas.microsoft.com/office/word/2010/wordprocessingInk" xmlns:wne="http://schemas.microsoft.com/office/word/2006/wordml" xmlns:wps="http://schemas.microsoft.com/office/word/2010/wordprocessingShape" mc:Ignorable="w14 w15 w16se w16cid w16 w16cex w16sdtdh w16sdtfl w16du wp14">
+<w:endnotes xmlns:wpc="http://schemas.microsoft.com/office/word/2010/wordprocessingCanvas" xmlns:cx="http://schemas.microsoft.com/office/drawing/2014/chartex" xmlns:cx1="http://schemas.microsoft.com/office/drawing/2015/9/8/chartex" xmlns:cx2="http://schemas.microsoft.com/office/drawing/2015/10/21/chartex" xmlns:cx3="http://schemas.microsoft.com/office/drawing/2016/5/9/chartex" xmlns:cx4="http://schemas.microsoft.com/office/drawing/2016/5/10/chartex" xmlns:cx5="http://schemas.microsoft.com/office/drawing/2016/5/11/chartex" xmlns:cx6="http://schemas.microsoft.com/office/drawing/2016/5/12/chartex" xmlns:cx7="http://schemas.microsoft.com/office/drawing/2016/5/13/chartex" xmlns:cx8="http://schemas.microsoft.com/office/drawing/2016/5/14/chartex" xmlns:mc="http://schemas.openxmlformats.org/markup-compatibility/2006" xmlns:aink="http://schemas.microsoft.com/office/drawing/2016/ink" xmlns:am3d="http://schemas.microsoft.com/office/drawing/2017/model3d" xmlns:o="urn:schemas-microsoft-com:office:office" xmlns:oel="http://schemas.microsoft.com/office/2019/extlst" xmlns:r="http://schemas.openxmlformats.org/officeDocument/2006/relationships" xmlns:m="http://schemas.openxmlformats.org/officeDocument/2006/math" xmlns:v="urn:schemas-microsoft-com:vml" xmlns:wp14="http://schemas.microsoft.com/office/word/2010/wordprocessingDrawing" xmlns:wp="http://schemas.openxmlformats.org/drawingml/2006/wordprocessingDrawing" xmlns:w10="urn:schemas-microsoft-com:office:word" xmlns:w="http://schemas.openxmlformats.org/wordprocessingml/2006/main" xmlns:w14="http://schemas.microsoft.com/office/word/2010/wordml" xmlns:w15="http://schemas.microsoft.com/office/word/2012/wordml" xmlns:w16cex="http://schemas.microsoft.com/office/word/2018/wordml/cex" xmlns:w16cid="http://schemas.microsoft.com/office/word/2016/wordml/cid" xmlns:w16="http://schemas.microsoft.com/office/word/2018/wordml" xmlns:w16sdtdh="http://schemas.microsoft.com/office/word/2020/wordml/sdtdatahash" xmlns:w16se="http://schemas.microsoft.com/office/word/2015/wordml/symex" xmlns:wpg="http://schemas.microsoft.com/office/word/2010/wordprocessingGroup" xmlns:wpi="http://schemas.microsoft.com/office/word/2010/wordprocessingInk" xmlns:wne="http://schemas.microsoft.com/office/word/2006/wordml" xmlns:wps="http://schemas.microsoft.com/office/word/2010/wordprocessingShape" mc:Ignorable="w14 w15 w16se w16cid w16 w16cex w16sdtdh wp14">
   <w:endnote w:type="separator" w:id="-1">
     <w:p>
       <w:pPr>
@@ -4768,7 +4799,7 @@
 </file>
 
 <file path=word/footer1.xml><?xml version="1.0" encoding="utf-8"?>
-<w:ftr xmlns:wpc="http://schemas.microsoft.com/office/word/2010/wordprocessingCanvas" xmlns:cx="http://schemas.microsoft.com/office/drawing/2014/chartex" xmlns:cx1="http://schemas.microsoft.com/office/drawing/2015/9/8/chartex" xmlns:cx2="http://schemas.microsoft.com/office/drawing/2015/10/21/chartex" xmlns:cx3="http://schemas.microsoft.com/office/drawing/2016/5/9/chartex" xmlns:cx4="http://schemas.microsoft.com/office/drawing/2016/5/10/chartex" xmlns:cx5="http://schemas.microsoft.com/office/drawing/2016/5/11/chartex" xmlns:cx6="http://schemas.microsoft.com/office/drawing/2016/5/12/chartex" xmlns:cx7="http://schemas.microsoft.com/office/drawing/2016/5/13/chartex" xmlns:cx8="http://schemas.microsoft.com/office/drawing/2016/5/14/chartex" xmlns:mc="http://schemas.openxmlformats.org/markup-compatibility/2006" xmlns:aink="http://schemas.microsoft.com/office/drawing/2016/ink" xmlns:am3d="http://schemas.microsoft.com/office/drawing/2017/model3d" xmlns:o="urn:schemas-microsoft-com:office:office" xmlns:oel="http://schemas.microsoft.com/office/2019/extlst" xmlns:r="http://schemas.openxmlformats.org/officeDocument/2006/relationships" xmlns:m="http://schemas.openxmlformats.org/officeDocument/2006/math" xmlns:v="urn:schemas-microsoft-com:vml" xmlns:wp14="http://schemas.microsoft.com/office/word/2010/wordprocessingDrawing" xmlns:wp="http://schemas.openxmlformats.org/drawingml/2006/wordprocessingDrawing" xmlns:w10="urn:schemas-microsoft-com:office:word" xmlns:w="http://schemas.openxmlformats.org/wordprocessingml/2006/main" xmlns:w14="http://schemas.microsoft.com/office/word/2010/wordml" xmlns:w15="http://schemas.microsoft.com/office/word/2012/wordml" xmlns:w16cex="http://schemas.microsoft.com/office/word/2018/wordml/cex" xmlns:w16cid="http://schemas.microsoft.com/office/word/2016/wordml/cid" xmlns:w16="http://schemas.microsoft.com/office/word/2018/wordml" xmlns:w16du="http://schemas.microsoft.com/office/word/2023/wordml/word16du" xmlns:w16sdtdh="http://schemas.microsoft.com/office/word/2020/wordml/sdtdatahash" xmlns:w16sdtfl="http://schemas.microsoft.com/office/word/2024/wordml/sdtformatlock" xmlns:w16se="http://schemas.microsoft.com/office/word/2015/wordml/symex" xmlns:wpg="http://schemas.microsoft.com/office/word/2010/wordprocessingGroup" xmlns:wpi="http://schemas.microsoft.com/office/word/2010/wordprocessingInk" xmlns:wne="http://schemas.microsoft.com/office/word/2006/wordml" xmlns:wps="http://schemas.microsoft.com/office/word/2010/wordprocessingShape" mc:Ignorable="w14 w15 w16se w16cid w16 w16cex w16sdtdh w16sdtfl w16du wp14">
+<w:ftr xmlns:wpc="http://schemas.microsoft.com/office/word/2010/wordprocessingCanvas" xmlns:cx="http://schemas.microsoft.com/office/drawing/2014/chartex" xmlns:cx1="http://schemas.microsoft.com/office/drawing/2015/9/8/chartex" xmlns:cx2="http://schemas.microsoft.com/office/drawing/2015/10/21/chartex" xmlns:cx3="http://schemas.microsoft.com/office/drawing/2016/5/9/chartex" xmlns:cx4="http://schemas.microsoft.com/office/drawing/2016/5/10/chartex" xmlns:cx5="http://schemas.microsoft.com/office/drawing/2016/5/11/chartex" xmlns:cx6="http://schemas.microsoft.com/office/drawing/2016/5/12/chartex" xmlns:cx7="http://schemas.microsoft.com/office/drawing/2016/5/13/chartex" xmlns:cx8="http://schemas.microsoft.com/office/drawing/2016/5/14/chartex" xmlns:mc="http://schemas.openxmlformats.org/markup-compatibility/2006" xmlns:aink="http://schemas.microsoft.com/office/drawing/2016/ink" xmlns:am3d="http://schemas.microsoft.com/office/drawing/2017/model3d" xmlns:o="urn:schemas-microsoft-com:office:office" xmlns:oel="http://schemas.microsoft.com/office/2019/extlst" xmlns:r="http://schemas.openxmlformats.org/officeDocument/2006/relationships" xmlns:m="http://schemas.openxmlformats.org/officeDocument/2006/math" xmlns:v="urn:schemas-microsoft-com:vml" xmlns:wp14="http://schemas.microsoft.com/office/word/2010/wordprocessingDrawing" xmlns:wp="http://schemas.openxmlformats.org/drawingml/2006/wordprocessingDrawing" xmlns:w10="urn:schemas-microsoft-com:office:word" xmlns:w="http://schemas.openxmlformats.org/wordprocessingml/2006/main" xmlns:w14="http://schemas.microsoft.com/office/word/2010/wordml" xmlns:w15="http://schemas.microsoft.com/office/word/2012/wordml" xmlns:w16cex="http://schemas.microsoft.com/office/word/2018/wordml/cex" xmlns:w16cid="http://schemas.microsoft.com/office/word/2016/wordml/cid" xmlns:w16="http://schemas.microsoft.com/office/word/2018/wordml" xmlns:w16sdtdh="http://schemas.microsoft.com/office/word/2020/wordml/sdtdatahash" xmlns:w16se="http://schemas.microsoft.com/office/word/2015/wordml/symex" xmlns:wpg="http://schemas.microsoft.com/office/word/2010/wordprocessingGroup" xmlns:wpi="http://schemas.microsoft.com/office/word/2010/wordprocessingInk" xmlns:wne="http://schemas.microsoft.com/office/word/2006/wordml" xmlns:wps="http://schemas.microsoft.com/office/word/2010/wordprocessingShape" mc:Ignorable="w14 w15 w16se w16cid w16 w16cex w16sdtdh wp14">
   <w:sdt>
     <w:sdtPr>
       <w:id w:val="1722559848"/>
@@ -4822,7 +4853,7 @@
 </file>
 
 <file path=word/footer2.xml><?xml version="1.0" encoding="utf-8"?>
-<w:ftr xmlns:wpc="http://schemas.microsoft.com/office/word/2010/wordprocessingCanvas" xmlns:cx="http://schemas.microsoft.com/office/drawing/2014/chartex" xmlns:cx1="http://schemas.microsoft.com/office/drawing/2015/9/8/chartex" xmlns:cx2="http://schemas.microsoft.com/office/drawing/2015/10/21/chartex" xmlns:cx3="http://schemas.microsoft.com/office/drawing/2016/5/9/chartex" xmlns:cx4="http://schemas.microsoft.com/office/drawing/2016/5/10/chartex" xmlns:cx5="http://schemas.microsoft.com/office/drawing/2016/5/11/chartex" xmlns:cx6="http://schemas.microsoft.com/office/drawing/2016/5/12/chartex" xmlns:cx7="http://schemas.microsoft.com/office/drawing/2016/5/13/chartex" xmlns:cx8="http://schemas.microsoft.com/office/drawing/2016/5/14/chartex" xmlns:mc="http://schemas.openxmlformats.org/markup-compatibility/2006" xmlns:aink="http://schemas.microsoft.com/office/drawing/2016/ink" xmlns:am3d="http://schemas.microsoft.com/office/drawing/2017/model3d" xmlns:o="urn:schemas-microsoft-com:office:office" xmlns:oel="http://schemas.microsoft.com/office/2019/extlst" xmlns:r="http://schemas.openxmlformats.org/officeDocument/2006/relationships" xmlns:m="http://schemas.openxmlformats.org/officeDocument/2006/math" xmlns:v="urn:schemas-microsoft-com:vml" xmlns:wp14="http://schemas.microsoft.com/office/word/2010/wordprocessingDrawing" xmlns:wp="http://schemas.openxmlformats.org/drawingml/2006/wordprocessingDrawing" xmlns:w10="urn:schemas-microsoft-com:office:word" xmlns:w="http://schemas.openxmlformats.org/wordprocessingml/2006/main" xmlns:w14="http://schemas.microsoft.com/office/word/2010/wordml" xmlns:w15="http://schemas.microsoft.com/office/word/2012/wordml" xmlns:w16cex="http://schemas.microsoft.com/office/word/2018/wordml/cex" xmlns:w16cid="http://schemas.microsoft.com/office/word/2016/wordml/cid" xmlns:w16="http://schemas.microsoft.com/office/word/2018/wordml" xmlns:w16du="http://schemas.microsoft.com/office/word/2023/wordml/word16du" xmlns:w16sdtdh="http://schemas.microsoft.com/office/word/2020/wordml/sdtdatahash" xmlns:w16sdtfl="http://schemas.microsoft.com/office/word/2024/wordml/sdtformatlock" xmlns:w16se="http://schemas.microsoft.com/office/word/2015/wordml/symex" xmlns:wpg="http://schemas.microsoft.com/office/word/2010/wordprocessingGroup" xmlns:wpi="http://schemas.microsoft.com/office/word/2010/wordprocessingInk" xmlns:wne="http://schemas.microsoft.com/office/word/2006/wordml" xmlns:wps="http://schemas.microsoft.com/office/word/2010/wordprocessingShape" mc:Ignorable="w14 w15 w16se w16cid w16 w16cex w16sdtdh w16sdtfl w16du wp14">
+<w:ftr xmlns:wpc="http://schemas.microsoft.com/office/word/2010/wordprocessingCanvas" xmlns:cx="http://schemas.microsoft.com/office/drawing/2014/chartex" xmlns:cx1="http://schemas.microsoft.com/office/drawing/2015/9/8/chartex" xmlns:cx2="http://schemas.microsoft.com/office/drawing/2015/10/21/chartex" xmlns:cx3="http://schemas.microsoft.com/office/drawing/2016/5/9/chartex" xmlns:cx4="http://schemas.microsoft.com/office/drawing/2016/5/10/chartex" xmlns:cx5="http://schemas.microsoft.com/office/drawing/2016/5/11/chartex" xmlns:cx6="http://schemas.microsoft.com/office/drawing/2016/5/12/chartex" xmlns:cx7="http://schemas.microsoft.com/office/drawing/2016/5/13/chartex" xmlns:cx8="http://schemas.microsoft.com/office/drawing/2016/5/14/chartex" xmlns:mc="http://schemas.openxmlformats.org/markup-compatibility/2006" xmlns:aink="http://schemas.microsoft.com/office/drawing/2016/ink" xmlns:am3d="http://schemas.microsoft.com/office/drawing/2017/model3d" xmlns:o="urn:schemas-microsoft-com:office:office" xmlns:oel="http://schemas.microsoft.com/office/2019/extlst" xmlns:r="http://schemas.openxmlformats.org/officeDocument/2006/relationships" xmlns:m="http://schemas.openxmlformats.org/officeDocument/2006/math" xmlns:v="urn:schemas-microsoft-com:vml" xmlns:wp14="http://schemas.microsoft.com/office/word/2010/wordprocessingDrawing" xmlns:wp="http://schemas.openxmlformats.org/drawingml/2006/wordprocessingDrawing" xmlns:w10="urn:schemas-microsoft-com:office:word" xmlns:w="http://schemas.openxmlformats.org/wordprocessingml/2006/main" xmlns:w14="http://schemas.microsoft.com/office/word/2010/wordml" xmlns:w15="http://schemas.microsoft.com/office/word/2012/wordml" xmlns:w16cex="http://schemas.microsoft.com/office/word/2018/wordml/cex" xmlns:w16cid="http://schemas.microsoft.com/office/word/2016/wordml/cid" xmlns:w16="http://schemas.microsoft.com/office/word/2018/wordml" xmlns:w16sdtdh="http://schemas.microsoft.com/office/word/2020/wordml/sdtdatahash" xmlns:w16se="http://schemas.microsoft.com/office/word/2015/wordml/symex" xmlns:wpg="http://schemas.microsoft.com/office/word/2010/wordprocessingGroup" xmlns:wpi="http://schemas.microsoft.com/office/word/2010/wordprocessingInk" xmlns:wne="http://schemas.microsoft.com/office/word/2006/wordml" xmlns:wps="http://schemas.microsoft.com/office/word/2010/wordprocessingShape" mc:Ignorable="w14 w15 w16se w16cid w16 w16cex w16sdtdh wp14">
   <w:p>
     <w:pPr>
       <w:pStyle w:val="Footer"/>
@@ -4838,7 +4869,7 @@
 </file>
 
 <file path=word/footnotes.xml><?xml version="1.0" encoding="utf-8"?>
-<w:footnotes xmlns:wpc="http://schemas.microsoft.com/office/word/2010/wordprocessingCanvas" xmlns:cx="http://schemas.microsoft.com/office/drawing/2014/chartex" xmlns:cx1="http://schemas.microsoft.com/office/drawing/2015/9/8/chartex" xmlns:cx2="http://schemas.microsoft.com/office/drawing/2015/10/21/chartex" xmlns:cx3="http://schemas.microsoft.com/office/drawing/2016/5/9/chartex" xmlns:cx4="http://schemas.microsoft.com/office/drawing/2016/5/10/chartex" xmlns:cx5="http://schemas.microsoft.com/office/drawing/2016/5/11/chartex" xmlns:cx6="http://schemas.microsoft.com/office/drawing/2016/5/12/chartex" xmlns:cx7="http://schemas.microsoft.com/office/drawing/2016/5/13/chartex" xmlns:cx8="http://schemas.microsoft.com/office/drawing/2016/5/14/chartex" xmlns:mc="http://schemas.openxmlformats.org/markup-compatibility/2006" xmlns:aink="http://schemas.microsoft.com/office/drawing/2016/ink" xmlns:am3d="http://schemas.microsoft.com/office/drawing/2017/model3d" xmlns:o="urn:schemas-microsoft-com:office:office" xmlns:oel="http://schemas.microsoft.com/office/2019/extlst" xmlns:r="http://schemas.openxmlformats.org/officeDocument/2006/relationships" xmlns:m="http://schemas.openxmlformats.org/officeDocument/2006/math" xmlns:v="urn:schemas-microsoft-com:vml" xmlns:wp14="http://schemas.microsoft.com/office/word/2010/wordprocessingDrawing" xmlns:wp="http://schemas.openxmlformats.org/drawingml/2006/wordprocessingDrawing" xmlns:w10="urn:schemas-microsoft-com:office:word" xmlns:w="http://schemas.openxmlformats.org/wordprocessingml/2006/main" xmlns:w14="http://schemas.microsoft.com/office/word/2010/wordml" xmlns:w15="http://schemas.microsoft.com/office/word/2012/wordml" xmlns:w16cex="http://schemas.microsoft.com/office/word/2018/wordml/cex" xmlns:w16cid="http://schemas.microsoft.com/office/word/2016/wordml/cid" xmlns:w16="http://schemas.microsoft.com/office/word/2018/wordml" xmlns:w16du="http://schemas.microsoft.com/office/word/2023/wordml/word16du" xmlns:w16sdtdh="http://schemas.microsoft.com/office/word/2020/wordml/sdtdatahash" xmlns:w16sdtfl="http://schemas.microsoft.com/office/word/2024/wordml/sdtformatlock" xmlns:w16se="http://schemas.microsoft.com/office/word/2015/wordml/symex" xmlns:wpg="http://schemas.microsoft.com/office/word/2010/wordprocessingGroup" xmlns:wpi="http://schemas.microsoft.com/office/word/2010/wordprocessingInk" xmlns:wne="http://schemas.microsoft.com/office/word/2006/wordml" xmlns:wps="http://schemas.microsoft.com/office/word/2010/wordprocessingShape" mc:Ignorable="w14 w15 w16se w16cid w16 w16cex w16sdtdh w16sdtfl w16du wp14">
+<w:footnotes xmlns:wpc="http://schemas.microsoft.com/office/word/2010/wordprocessingCanvas" xmlns:cx="http://schemas.microsoft.com/office/drawing/2014/chartex" xmlns:cx1="http://schemas.microsoft.com/office/drawing/2015/9/8/chartex" xmlns:cx2="http://schemas.microsoft.com/office/drawing/2015/10/21/chartex" xmlns:cx3="http://schemas.microsoft.com/office/drawing/2016/5/9/chartex" xmlns:cx4="http://schemas.microsoft.com/office/drawing/2016/5/10/chartex" xmlns:cx5="http://schemas.microsoft.com/office/drawing/2016/5/11/chartex" xmlns:cx6="http://schemas.microsoft.com/office/drawing/2016/5/12/chartex" xmlns:cx7="http://schemas.microsoft.com/office/drawing/2016/5/13/chartex" xmlns:cx8="http://schemas.microsoft.com/office/drawing/2016/5/14/chartex" xmlns:mc="http://schemas.openxmlformats.org/markup-compatibility/2006" xmlns:aink="http://schemas.microsoft.com/office/drawing/2016/ink" xmlns:am3d="http://schemas.microsoft.com/office/drawing/2017/model3d" xmlns:o="urn:schemas-microsoft-com:office:office" xmlns:oel="http://schemas.microsoft.com/office/2019/extlst" xmlns:r="http://schemas.openxmlformats.org/officeDocument/2006/relationships" xmlns:m="http://schemas.openxmlformats.org/officeDocument/2006/math" xmlns:v="urn:schemas-microsoft-com:vml" xmlns:wp14="http://schemas.microsoft.com/office/word/2010/wordprocessingDrawing" xmlns:wp="http://schemas.openxmlformats.org/drawingml/2006/wordprocessingDrawing" xmlns:w10="urn:schemas-microsoft-com:office:word" xmlns:w="http://schemas.openxmlformats.org/wordprocessingml/2006/main" xmlns:w14="http://schemas.microsoft.com/office/word/2010/wordml" xmlns:w15="http://schemas.microsoft.com/office/word/2012/wordml" xmlns:w16cex="http://schemas.microsoft.com/office/word/2018/wordml/cex" xmlns:w16cid="http://schemas.microsoft.com/office/word/2016/wordml/cid" xmlns:w16="http://schemas.microsoft.com/office/word/2018/wordml" xmlns:w16sdtdh="http://schemas.microsoft.com/office/word/2020/wordml/sdtdatahash" xmlns:w16se="http://schemas.microsoft.com/office/word/2015/wordml/symex" xmlns:wpg="http://schemas.microsoft.com/office/word/2010/wordprocessingGroup" xmlns:wpi="http://schemas.microsoft.com/office/word/2010/wordprocessingInk" xmlns:wne="http://schemas.microsoft.com/office/word/2006/wordml" xmlns:wps="http://schemas.microsoft.com/office/word/2010/wordprocessingShape" mc:Ignorable="w14 w15 w16se w16cid w16 w16cex w16sdtdh wp14">
   <w:footnote w:type="separator" w:id="-1">
     <w:p>
       <w:pPr>
@@ -4863,7 +4894,7 @@
 </file>
 
 <file path=word/numbering.xml><?xml version="1.0" encoding="utf-8"?>
-<w:numbering xmlns:wpc="http://schemas.microsoft.com/office/word/2010/wordprocessingCanvas" xmlns:cx="http://schemas.microsoft.com/office/drawing/2014/chartex" xmlns:cx1="http://schemas.microsoft.com/office/drawing/2015/9/8/chartex" xmlns:cx2="http://schemas.microsoft.com/office/drawing/2015/10/21/chartex" xmlns:cx3="http://schemas.microsoft.com/office/drawing/2016/5/9/chartex" xmlns:cx4="http://schemas.microsoft.com/office/drawing/2016/5/10/chartex" xmlns:cx5="http://schemas.microsoft.com/office/drawing/2016/5/11/chartex" xmlns:cx6="http://schemas.microsoft.com/office/drawing/2016/5/12/chartex" xmlns:cx7="http://schemas.microsoft.com/office/drawing/2016/5/13/chartex" xmlns:cx8="http://schemas.microsoft.com/office/drawing/2016/5/14/chartex" xmlns:mc="http://schemas.openxmlformats.org/markup-compatibility/2006" xmlns:aink="http://schemas.microsoft.com/office/drawing/2016/ink" xmlns:am3d="http://schemas.microsoft.com/office/drawing/2017/model3d" xmlns:o="urn:schemas-microsoft-com:office:office" xmlns:oel="http://schemas.microsoft.com/office/2019/extlst" xmlns:r="http://schemas.openxmlformats.org/officeDocument/2006/relationships" xmlns:m="http://schemas.openxmlformats.org/officeDocument/2006/math" xmlns:v="urn:schemas-microsoft-com:vml" xmlns:wp14="http://schemas.microsoft.com/office/word/2010/wordprocessingDrawing" xmlns:wp="http://schemas.openxmlformats.org/drawingml/2006/wordprocessingDrawing" xmlns:w10="urn:schemas-microsoft-com:office:word" xmlns:w="http://schemas.openxmlformats.org/wordprocessingml/2006/main" xmlns:w14="http://schemas.microsoft.com/office/word/2010/wordml" xmlns:w15="http://schemas.microsoft.com/office/word/2012/wordml" xmlns:w16cex="http://schemas.microsoft.com/office/word/2018/wordml/cex" xmlns:w16cid="http://schemas.microsoft.com/office/word/2016/wordml/cid" xmlns:w16="http://schemas.microsoft.com/office/word/2018/wordml" xmlns:w16du="http://schemas.microsoft.com/office/word/2023/wordml/word16du" xmlns:w16sdtdh="http://schemas.microsoft.com/office/word/2020/wordml/sdtdatahash" xmlns:w16sdtfl="http://schemas.microsoft.com/office/word/2024/wordml/sdtformatlock" xmlns:w16se="http://schemas.microsoft.com/office/word/2015/wordml/symex" xmlns:wpg="http://schemas.microsoft.com/office/word/2010/wordprocessingGroup" xmlns:wpi="http://schemas.microsoft.com/office/word/2010/wordprocessingInk" xmlns:wne="http://schemas.microsoft.com/office/word/2006/wordml" xmlns:wps="http://schemas.microsoft.com/office/word/2010/wordprocessingShape" mc:Ignorable="w14 w15 w16se w16cid w16 w16cex w16sdtdh w16sdtfl w16du wp14">
+<w:numbering xmlns:wpc="http://schemas.microsoft.com/office/word/2010/wordprocessingCanvas" xmlns:cx="http://schemas.microsoft.com/office/drawing/2014/chartex" xmlns:cx1="http://schemas.microsoft.com/office/drawing/2015/9/8/chartex" xmlns:cx2="http://schemas.microsoft.com/office/drawing/2015/10/21/chartex" xmlns:cx3="http://schemas.microsoft.com/office/drawing/2016/5/9/chartex" xmlns:cx4="http://schemas.microsoft.com/office/drawing/2016/5/10/chartex" xmlns:cx5="http://schemas.microsoft.com/office/drawing/2016/5/11/chartex" xmlns:cx6="http://schemas.microsoft.com/office/drawing/2016/5/12/chartex" xmlns:cx7="http://schemas.microsoft.com/office/drawing/2016/5/13/chartex" xmlns:cx8="http://schemas.microsoft.com/office/drawing/2016/5/14/chartex" xmlns:mc="http://schemas.openxmlformats.org/markup-compatibility/2006" xmlns:aink="http://schemas.microsoft.com/office/drawing/2016/ink" xmlns:am3d="http://schemas.microsoft.com/office/drawing/2017/model3d" xmlns:o="urn:schemas-microsoft-com:office:office" xmlns:oel="http://schemas.microsoft.com/office/2019/extlst" xmlns:r="http://schemas.openxmlformats.org/officeDocument/2006/relationships" xmlns:m="http://schemas.openxmlformats.org/officeDocument/2006/math" xmlns:v="urn:schemas-microsoft-com:vml" xmlns:wp14="http://schemas.microsoft.com/office/word/2010/wordprocessingDrawing" xmlns:wp="http://schemas.openxmlformats.org/drawingml/2006/wordprocessingDrawing" xmlns:w10="urn:schemas-microsoft-com:office:word" xmlns:w="http://schemas.openxmlformats.org/wordprocessingml/2006/main" xmlns:w14="http://schemas.microsoft.com/office/word/2010/wordml" xmlns:w15="http://schemas.microsoft.com/office/word/2012/wordml" xmlns:w16cex="http://schemas.microsoft.com/office/word/2018/wordml/cex" xmlns:w16cid="http://schemas.microsoft.com/office/word/2016/wordml/cid" xmlns:w16="http://schemas.microsoft.com/office/word/2018/wordml" xmlns:w16sdtdh="http://schemas.microsoft.com/office/word/2020/wordml/sdtdatahash" xmlns:w16se="http://schemas.microsoft.com/office/word/2015/wordml/symex" xmlns:wpg="http://schemas.microsoft.com/office/word/2010/wordprocessingGroup" xmlns:wpi="http://schemas.microsoft.com/office/word/2010/wordprocessingInk" xmlns:wne="http://schemas.microsoft.com/office/word/2006/wordml" xmlns:wps="http://schemas.microsoft.com/office/word/2010/wordprocessingShape" mc:Ignorable="w14 w15 w16se w16cid w16 w16cex w16sdtdh wp14">
   <w:abstractNum w:abstractNumId="0" w15:restartNumberingAfterBreak="0">
     <w:nsid w:val="113B3281"/>
     <w:multiLevelType w:val="hybridMultilevel"/>
@@ -5387,7 +5418,7 @@
 </file>
 
 <file path=word/styles.xml><?xml version="1.0" encoding="utf-8"?>
-<w:styles xmlns:mc="http://schemas.openxmlformats.org/markup-compatibility/2006" xmlns:r="http://schemas.openxmlformats.org/officeDocument/2006/relationships" xmlns:w="http://schemas.openxmlformats.org/wordprocessingml/2006/main" xmlns:w14="http://schemas.microsoft.com/office/word/2010/wordml" xmlns:w15="http://schemas.microsoft.com/office/word/2012/wordml" xmlns:w16cex="http://schemas.microsoft.com/office/word/2018/wordml/cex" xmlns:w16cid="http://schemas.microsoft.com/office/word/2016/wordml/cid" xmlns:w16="http://schemas.microsoft.com/office/word/2018/wordml" xmlns:w16du="http://schemas.microsoft.com/office/word/2023/wordml/word16du" xmlns:w16sdtdh="http://schemas.microsoft.com/office/word/2020/wordml/sdtdatahash" xmlns:w16sdtfl="http://schemas.microsoft.com/office/word/2024/wordml/sdtformatlock" xmlns:w16se="http://schemas.microsoft.com/office/word/2015/wordml/symex" mc:Ignorable="w14 w15 w16se w16cid w16 w16cex w16sdtdh w16sdtfl w16du">
+<w:styles xmlns:mc="http://schemas.openxmlformats.org/markup-compatibility/2006" xmlns:r="http://schemas.openxmlformats.org/officeDocument/2006/relationships" xmlns:w="http://schemas.openxmlformats.org/wordprocessingml/2006/main" xmlns:w14="http://schemas.microsoft.com/office/word/2010/wordml" xmlns:w15="http://schemas.microsoft.com/office/word/2012/wordml" xmlns:w16cex="http://schemas.microsoft.com/office/word/2018/wordml/cex" xmlns:w16cid="http://schemas.microsoft.com/office/word/2016/wordml/cid" xmlns:w16="http://schemas.microsoft.com/office/word/2018/wordml" xmlns:w16sdtdh="http://schemas.microsoft.com/office/word/2020/wordml/sdtdatahash" xmlns:w16se="http://schemas.microsoft.com/office/word/2015/wordml/symex" mc:Ignorable="w14 w15 w16se w16cid w16 w16cex w16sdtdh">
   <w:docDefaults>
     <w:rPrDefault>
       <w:rPr>
@@ -6442,27 +6473,6 @@
 </file>
 
 <file path=customXml/item1.xml><?xml version="1.0" encoding="utf-8"?>
-<b:Sources xmlns:b="http://schemas.openxmlformats.org/officeDocument/2006/bibliography" xmlns="http://schemas.openxmlformats.org/officeDocument/2006/bibliography" SelectedStyle="\APASixthEditionOfficeOnline.xsl" StyleName="APA" Version="6"/>
-</file>
-
-<file path=customXml/item2.xml><?xml version="1.0" encoding="utf-8"?>
-<p:properties xmlns:p="http://schemas.microsoft.com/office/2006/metadata/properties" xmlns:xsi="http://www.w3.org/2001/XMLSchema-instance" xmlns:pc="http://schemas.microsoft.com/office/infopath/2007/PartnerControls">
-  <documentManagement>
-    <ReferenceId xmlns="eef22584-95ed-477f-8b51-08e32d23c53e" xsi:nil="true"/>
-  </documentManagement>
-</p:properties>
-</file>
-
-<file path=customXml/item3.xml><?xml version="1.0" encoding="utf-8"?>
-<?mso-contentType ?>
-<FormTemplates xmlns="http://schemas.microsoft.com/sharepoint/v3/contenttype/forms">
-  <Display>DocumentLibraryForm</Display>
-  <Edit>DocumentLibraryForm</Edit>
-  <New>DocumentLibraryForm</New>
-</FormTemplates>
-</file>
-
-<file path=customXml/item4.xml><?xml version="1.0" encoding="utf-8"?>
 <ct:contentTypeSchema xmlns:ct="http://schemas.microsoft.com/office/2006/metadata/contentType" xmlns:ma="http://schemas.microsoft.com/office/2006/metadata/properties/metaAttributes" ct:_="" ma:_="" ma:contentTypeName="Document" ma:contentTypeID="0x010100996EDD3AF3B48C4BB8C711B5733C39F6" ma:contentTypeVersion="8" ma:contentTypeDescription="Create a new document." ma:contentTypeScope="" ma:versionID="7877da1482023c7e2a024716cc794e3c">
   <xsd:schema xmlns:xsd="http://www.w3.org/2001/XMLSchema" xmlns:xs="http://www.w3.org/2001/XMLSchema" xmlns:p="http://schemas.microsoft.com/office/2006/metadata/properties" xmlns:ns2="eef22584-95ed-477f-8b51-08e32d23c53e" targetNamespace="http://schemas.microsoft.com/office/2006/metadata/properties" ma:root="true" ma:fieldsID="517bd48a1ce1592919b2d7c36f8fb3bc" ns2:_="">
     <xsd:import namespace="eef22584-95ed-477f-8b51-08e32d23c53e"/>
@@ -6630,33 +6640,28 @@
 </ct:contentTypeSchema>
 </file>
 
-<file path=customXml/itemProps1.xml><?xml version="1.0" encoding="utf-8"?>
-<ds:datastoreItem xmlns:ds="http://schemas.openxmlformats.org/officeDocument/2006/customXml" ds:itemID="{B9F390CF-A74E-4EB5-BD54-ED10285954D8}">
-  <ds:schemaRefs>
-    <ds:schemaRef ds:uri="http://schemas.openxmlformats.org/officeDocument/2006/bibliography"/>
-  </ds:schemaRefs>
-</ds:datastoreItem>
+<file path=customXml/item2.xml><?xml version="1.0" encoding="utf-8"?>
+<?mso-contentType ?>
+<FormTemplates xmlns="http://schemas.microsoft.com/sharepoint/v3/contenttype/forms">
+  <Display>DocumentLibraryForm</Display>
+  <Edit>DocumentLibraryForm</Edit>
+  <New>DocumentLibraryForm</New>
+</FormTemplates>
 </file>
 
-<file path=customXml/itemProps2.xml><?xml version="1.0" encoding="utf-8"?>
-<ds:datastoreItem xmlns:ds="http://schemas.openxmlformats.org/officeDocument/2006/customXml" ds:itemID="{475DFC7A-9F3E-4A94-87BF-72BD504B2E67}">
-  <ds:schemaRefs>
-    <ds:schemaRef ds:uri="http://schemas.microsoft.com/office/2006/metadata/properties"/>
-    <ds:schemaRef ds:uri="http://schemas.microsoft.com/office/infopath/2007/PartnerControls"/>
-    <ds:schemaRef ds:uri="eef22584-95ed-477f-8b51-08e32d23c53e"/>
-  </ds:schemaRefs>
-</ds:datastoreItem>
+<file path=customXml/item3.xml><?xml version="1.0" encoding="utf-8"?>
+<p:properties xmlns:p="http://schemas.microsoft.com/office/2006/metadata/properties" xmlns:xsi="http://www.w3.org/2001/XMLSchema-instance" xmlns:pc="http://schemas.microsoft.com/office/infopath/2007/PartnerControls">
+  <documentManagement>
+    <ReferenceId xmlns="eef22584-95ed-477f-8b51-08e32d23c53e" xsi:nil="true"/>
+  </documentManagement>
+</p:properties>
 </file>
 
-<file path=customXml/itemProps3.xml><?xml version="1.0" encoding="utf-8"?>
-<ds:datastoreItem xmlns:ds="http://schemas.openxmlformats.org/officeDocument/2006/customXml" ds:itemID="{80B60E6D-8162-4682-B39F-2AD99E9D2FEB}">
-  <ds:schemaRefs>
-    <ds:schemaRef ds:uri="http://schemas.microsoft.com/sharepoint/v3/contenttype/forms"/>
-  </ds:schemaRefs>
-</ds:datastoreItem>
+<file path=customXml/item4.xml><?xml version="1.0" encoding="utf-8"?>
+<b:Sources xmlns:b="http://schemas.openxmlformats.org/officeDocument/2006/bibliography" xmlns="http://schemas.openxmlformats.org/officeDocument/2006/bibliography" SelectedStyle="\APASixthEditionOfficeOnline.xsl" StyleName="APA" Version="6"/>
 </file>
 
-<file path=customXml/itemProps4.xml><?xml version="1.0" encoding="utf-8"?>
+<file path=customXml/itemProps1.xml><?xml version="1.0" encoding="utf-8"?>
 <ds:datastoreItem xmlns:ds="http://schemas.openxmlformats.org/officeDocument/2006/customXml" ds:itemID="{975E2EC3-F226-478B-88DA-77A0B44A31C0}">
   <ds:schemaRefs>
     <ds:schemaRef ds:uri="http://schemas.microsoft.com/office/2006/metadata/contentType"/>
@@ -6672,4 +6677,30 @@
     <ds:schemaRef ds:uri="http://schemas.microsoft.com/internal/obd"/>
   </ds:schemaRefs>
 </ds:datastoreItem>
+</file>
+
+<file path=customXml/itemProps2.xml><?xml version="1.0" encoding="utf-8"?>
+<ds:datastoreItem xmlns:ds="http://schemas.openxmlformats.org/officeDocument/2006/customXml" ds:itemID="{80B60E6D-8162-4682-B39F-2AD99E9D2FEB}">
+  <ds:schemaRefs>
+    <ds:schemaRef ds:uri="http://schemas.microsoft.com/sharepoint/v3/contenttype/forms"/>
+  </ds:schemaRefs>
+</ds:datastoreItem>
+</file>
+
+<file path=customXml/itemProps3.xml><?xml version="1.0" encoding="utf-8"?>
+<ds:datastoreItem xmlns:ds="http://schemas.openxmlformats.org/officeDocument/2006/customXml" ds:itemID="{475DFC7A-9F3E-4A94-87BF-72BD504B2E67}">
+  <ds:schemaRefs>
+    <ds:schemaRef ds:uri="http://schemas.microsoft.com/office/2006/metadata/properties"/>
+    <ds:schemaRef ds:uri="http://schemas.microsoft.com/office/infopath/2007/PartnerControls"/>
+    <ds:schemaRef ds:uri="eef22584-95ed-477f-8b51-08e32d23c53e"/>
+  </ds:schemaRefs>
+</ds:datastoreItem>
+</file>
+
+<file path=customXml/itemProps4.xml><?xml version="1.0" encoding="utf-8"?>
+<ds:datastoreItem xmlns:ds="http://schemas.openxmlformats.org/officeDocument/2006/customXml" ds:itemID="{B9F390CF-A74E-4EB5-BD54-ED10285954D8}">
+  <ds:schemaRefs>
+    <ds:schemaRef ds:uri="http://schemas.openxmlformats.org/officeDocument/2006/bibliography"/>
+  </ds:schemaRefs>
+</ds:datastoreItem>
 </file>
</xml_diff>

<commit_message>
Added comments explaing and adding context to the function of the code to the 'Planes' and 'Flights' table.
</commit_message>
<xml_diff>
--- a/12TPI Project Write-Up.docx
+++ b/12TPI Project Write-Up.docx
@@ -174,8 +174,17 @@
           <w:rFonts w:eastAsia="Times New Roman"/>
           <w:lang w:val="en-NZ" w:eastAsia="en-NZ"/>
         </w:rPr>
-        <w:t xml:space="preserve"> with this project</w:t>
-      </w:r>
+        <w:t xml:space="preserve"> with this </w:t>
+      </w:r>
+      <w:proofErr w:type="gramStart"/>
+      <w:r>
+        <w:rPr>
+          <w:rFonts w:eastAsia="Times New Roman"/>
+          <w:lang w:val="en-NZ" w:eastAsia="en-NZ"/>
+        </w:rPr>
+        <w:t>project</w:t>
+      </w:r>
+      <w:proofErr w:type="gramEnd"/>
     </w:p>
     <w:p>
       <w:pPr>
@@ -195,8 +204,17 @@
           <w:rFonts w:eastAsia="Times New Roman"/>
           <w:lang w:val="en-NZ" w:eastAsia="en-NZ"/>
         </w:rPr>
-        <w:t>Refer to your assignment document</w:t>
-      </w:r>
+        <w:t xml:space="preserve">Refer to your assignment </w:t>
+      </w:r>
+      <w:proofErr w:type="gramStart"/>
+      <w:r>
+        <w:rPr>
+          <w:rFonts w:eastAsia="Times New Roman"/>
+          <w:lang w:val="en-NZ" w:eastAsia="en-NZ"/>
+        </w:rPr>
+        <w:t>document</w:t>
+      </w:r>
+      <w:proofErr w:type="gramEnd"/>
     </w:p>
     <w:p>
       <w:pPr>
@@ -2741,9 +2759,22 @@
           <w:szCs w:val="28"/>
           <w:lang w:val="en-NZ" w:eastAsia="en-NZ"/>
         </w:rPr>
-        <w:t>Use case</w:t>
+        <w:t xml:space="preserve">Use </w:t>
+      </w:r>
+      <w:proofErr w:type="gramStart"/>
+      <w:r>
+        <w:rPr>
+          <w:rFonts w:asciiTheme="minorHAnsi" w:eastAsia="Times New Roman" w:hAnsiTheme="minorHAnsi" w:cstheme="minorHAnsi"/>
+          <w:b/>
+          <w:bCs/>
+          <w:sz w:val="28"/>
+          <w:szCs w:val="28"/>
+          <w:lang w:val="en-NZ" w:eastAsia="en-NZ"/>
+        </w:rPr>
+        <w:t>case</w:t>
       </w:r>
       <w:bookmarkEnd w:id="2"/>
+      <w:proofErr w:type="gramEnd"/>
       <w:r>
         <w:rPr>
           <w:rFonts w:asciiTheme="minorHAnsi" w:eastAsia="Times New Roman" w:hAnsiTheme="minorHAnsi" w:cstheme="minorHAnsi"/>
@@ -2962,9 +2993,22 @@
           <w:szCs w:val="28"/>
           <w:lang w:val="en-NZ" w:eastAsia="en-NZ"/>
         </w:rPr>
-        <w:t>End users</w:t>
+        <w:t xml:space="preserve">End </w:t>
+      </w:r>
+      <w:proofErr w:type="gramStart"/>
+      <w:r>
+        <w:rPr>
+          <w:rFonts w:asciiTheme="minorHAnsi" w:eastAsia="Times New Roman" w:hAnsiTheme="minorHAnsi" w:cstheme="minorHAnsi"/>
+          <w:b/>
+          <w:bCs/>
+          <w:sz w:val="28"/>
+          <w:szCs w:val="28"/>
+          <w:lang w:val="en-NZ" w:eastAsia="en-NZ"/>
+        </w:rPr>
+        <w:t>users</w:t>
       </w:r>
       <w:bookmarkEnd w:id="6"/>
+      <w:proofErr w:type="gramEnd"/>
     </w:p>
     <w:p>
       <w:pPr>
@@ -3352,8 +3396,20 @@
           <w:szCs w:val="24"/>
           <w:lang w:val="en-NZ" w:eastAsia="en-NZ"/>
         </w:rPr>
-        <w:t>Expensive to set up and maintain</w:t>
-      </w:r>
+        <w:t xml:space="preserve">Expensive to set up and </w:t>
+      </w:r>
+      <w:proofErr w:type="gramStart"/>
+      <w:r>
+        <w:rPr>
+          <w:rFonts w:eastAsia="Times New Roman" w:cstheme="minorHAnsi"/>
+          <w:color w:val="2F5496" w:themeColor="accent1" w:themeShade="BF"/>
+          <w:sz w:val="24"/>
+          <w:szCs w:val="24"/>
+          <w:lang w:val="en-NZ" w:eastAsia="en-NZ"/>
+        </w:rPr>
+        <w:t>maintain</w:t>
+      </w:r>
+      <w:proofErr w:type="gramEnd"/>
     </w:p>
     <w:p>
       <w:pPr>
@@ -3477,8 +3533,9 @@
           <w:szCs w:val="24"/>
           <w:lang w:val="en-NZ" w:eastAsia="en-NZ"/>
         </w:rPr>
-        <w:t>Consistency will be easie</w:t>
-      </w:r>
+        <w:t xml:space="preserve">Consistency will be </w:t>
+      </w:r>
+      <w:proofErr w:type="gramStart"/>
       <w:r>
         <w:rPr>
           <w:rFonts w:eastAsia="Times New Roman" w:cstheme="minorHAnsi"/>
@@ -3487,8 +3544,19 @@
           <w:szCs w:val="24"/>
           <w:lang w:val="en-NZ" w:eastAsia="en-NZ"/>
         </w:rPr>
+        <w:t>easie</w:t>
+      </w:r>
+      <w:r>
+        <w:rPr>
+          <w:rFonts w:eastAsia="Times New Roman" w:cstheme="minorHAnsi"/>
+          <w:color w:val="2F5496" w:themeColor="accent1" w:themeShade="BF"/>
+          <w:sz w:val="24"/>
+          <w:szCs w:val="24"/>
+          <w:lang w:val="en-NZ" w:eastAsia="en-NZ"/>
+        </w:rPr>
         <w:t>r</w:t>
       </w:r>
+      <w:proofErr w:type="gramEnd"/>
     </w:p>
     <w:p>
       <w:pPr>
@@ -3520,15 +3588,6 @@
         </w:rPr>
         <w:t xml:space="preserve"> </w:t>
       </w:r>
-    </w:p>
-    <w:p>
-      <w:pPr>
-        <w:pStyle w:val="Heading2"/>
-        <w:rPr>
-          <w:rFonts w:eastAsia="Times New Roman"/>
-          <w:lang w:val="en-NZ" w:eastAsia="en-NZ"/>
-        </w:rPr>
-      </w:pPr>
     </w:p>
     <w:p>
       <w:pPr>
@@ -3700,28 +3759,23 @@
       <w:pPr>
         <w:pStyle w:val="Heading2"/>
         <w:rPr>
-          <w:rFonts w:ascii="Arial Narrow" w:eastAsia="Times New Roman" w:hAnsi="Arial Narrow" w:cs="Segoe UI"/>
-          <w:sz w:val="24"/>
-          <w:szCs w:val="24"/>
-          <w:lang w:val="en-NZ" w:eastAsia="en-NZ"/>
+          <w:rFonts w:asciiTheme="minorHAnsi" w:hAnsiTheme="minorHAnsi" w:cstheme="minorHAnsi"/>
+          <w:b/>
+          <w:bCs/>
+          <w:sz w:val="28"/>
+          <w:szCs w:val="28"/>
         </w:rPr>
       </w:pPr>
       <w:bookmarkStart w:id="12" w:name="_Toc141881219"/>
       <w:r>
         <w:rPr>
-          <w:rFonts w:eastAsia="Times New Roman"/>
-          <w:lang w:val="en-NZ" w:eastAsia="en-NZ"/>
-        </w:rPr>
-        <w:t>Flowcharts</w:t>
-      </w:r>
-      <w:r>
-        <w:rPr>
-          <w:rFonts w:ascii="Arial Narrow" w:eastAsia="Times New Roman" w:hAnsi="Arial Narrow" w:cs="Segoe UI"/>
-          <w:sz w:val="24"/>
-          <w:szCs w:val="24"/>
-          <w:lang w:val="en-NZ" w:eastAsia="en-NZ"/>
-        </w:rPr>
-        <w:t>/Pseudocodes</w:t>
+          <w:rFonts w:asciiTheme="minorHAnsi" w:hAnsiTheme="minorHAnsi" w:cstheme="minorHAnsi"/>
+          <w:b/>
+          <w:bCs/>
+          <w:sz w:val="28"/>
+          <w:szCs w:val="28"/>
+        </w:rPr>
+        <w:t>Flowcharts/Pseudocodes</w:t>
       </w:r>
       <w:bookmarkEnd w:id="12"/>
     </w:p>
@@ -3741,30 +3795,37 @@
       <w:pPr>
         <w:pStyle w:val="Heading2"/>
         <w:rPr>
-          <w:rFonts w:ascii="Arial Narrow" w:eastAsia="Times New Roman" w:hAnsi="Arial Narrow" w:cs="Segoe UI"/>
-          <w:sz w:val="24"/>
-          <w:szCs w:val="24"/>
-          <w:lang w:val="en-NZ" w:eastAsia="en-NZ"/>
+          <w:rFonts w:asciiTheme="minorHAnsi" w:hAnsiTheme="minorHAnsi" w:cstheme="minorHAnsi"/>
+          <w:b/>
+          <w:bCs/>
+          <w:sz w:val="28"/>
+          <w:szCs w:val="28"/>
         </w:rPr>
       </w:pPr>
       <w:bookmarkStart w:id="13" w:name="_Toc141881220"/>
       <w:r>
         <w:rPr>
-          <w:rFonts w:eastAsia="Times New Roman"/>
-          <w:lang w:val="en-NZ" w:eastAsia="en-NZ"/>
-        </w:rPr>
-        <w:t>Use</w:t>
-      </w:r>
-      <w:r>
-        <w:rPr>
-          <w:rFonts w:ascii="Arial Narrow" w:eastAsia="Times New Roman" w:hAnsi="Arial Narrow" w:cs="Segoe UI"/>
-          <w:sz w:val="24"/>
-          <w:szCs w:val="24"/>
-          <w:lang w:val="en-NZ" w:eastAsia="en-NZ"/>
-        </w:rPr>
-        <w:t xml:space="preserve"> case diagram</w:t>
+          <w:rFonts w:asciiTheme="minorHAnsi" w:hAnsiTheme="minorHAnsi" w:cstheme="minorHAnsi"/>
+          <w:b/>
+          <w:bCs/>
+          <w:sz w:val="28"/>
+          <w:szCs w:val="28"/>
+        </w:rPr>
+        <w:t xml:space="preserve">Use case </w:t>
+      </w:r>
+      <w:proofErr w:type="gramStart"/>
+      <w:r>
+        <w:rPr>
+          <w:rFonts w:asciiTheme="minorHAnsi" w:hAnsiTheme="minorHAnsi" w:cstheme="minorHAnsi"/>
+          <w:b/>
+          <w:bCs/>
+          <w:sz w:val="28"/>
+          <w:szCs w:val="28"/>
+        </w:rPr>
+        <w:t>diagram</w:t>
       </w:r>
       <w:bookmarkEnd w:id="13"/>
+      <w:proofErr w:type="gramEnd"/>
     </w:p>
     <w:p>
       <w:pPr>
@@ -3784,28 +3845,23 @@
       <w:pPr>
         <w:pStyle w:val="Heading2"/>
         <w:rPr>
-          <w:rFonts w:ascii="Arial Narrow" w:eastAsia="Times New Roman" w:hAnsi="Arial Narrow" w:cs="Segoe UI"/>
-          <w:sz w:val="24"/>
-          <w:szCs w:val="24"/>
-          <w:lang w:val="en-NZ" w:eastAsia="en-NZ"/>
+          <w:rFonts w:asciiTheme="minorHAnsi" w:hAnsiTheme="minorHAnsi" w:cstheme="minorHAnsi"/>
+          <w:b/>
+          <w:bCs/>
+          <w:sz w:val="28"/>
+          <w:szCs w:val="28"/>
         </w:rPr>
       </w:pPr>
       <w:bookmarkStart w:id="14" w:name="_Toc141881221"/>
       <w:r>
         <w:rPr>
-          <w:rFonts w:eastAsia="Times New Roman"/>
-          <w:lang w:val="en-NZ" w:eastAsia="en-NZ"/>
-        </w:rPr>
-        <w:t>Entity</w:t>
-      </w:r>
-      <w:r>
-        <w:rPr>
-          <w:rFonts w:ascii="Arial Narrow" w:eastAsia="Times New Roman" w:hAnsi="Arial Narrow" w:cs="Segoe UI"/>
-          <w:sz w:val="24"/>
-          <w:szCs w:val="24"/>
-          <w:lang w:val="en-NZ" w:eastAsia="en-NZ"/>
-        </w:rPr>
-        <w:t xml:space="preserve"> relationship diagram</w:t>
+          <w:rFonts w:asciiTheme="minorHAnsi" w:hAnsiTheme="minorHAnsi" w:cstheme="minorHAnsi"/>
+          <w:b/>
+          <w:bCs/>
+          <w:sz w:val="28"/>
+          <w:szCs w:val="28"/>
+        </w:rPr>
+        <w:t>Entity relationship diagram</w:t>
       </w:r>
       <w:bookmarkEnd w:id="14"/>
     </w:p>
@@ -3827,40 +3883,100 @@
       <w:pPr>
         <w:pStyle w:val="Heading2"/>
         <w:rPr>
-          <w:rFonts w:ascii="Arial Narrow" w:eastAsia="Times New Roman" w:hAnsi="Arial Narrow" w:cs="Segoe UI"/>
-          <w:sz w:val="24"/>
-          <w:szCs w:val="24"/>
+          <w:rFonts w:eastAsia="Times New Roman"/>
           <w:lang w:val="en-NZ" w:eastAsia="en-NZ"/>
         </w:rPr>
       </w:pPr>
       <w:bookmarkStart w:id="15" w:name="_Toc141881222"/>
-      <w:r>
-        <w:rPr>
-          <w:rFonts w:eastAsia="Times New Roman"/>
-          <w:lang w:val="en-NZ" w:eastAsia="en-NZ"/>
+    </w:p>
+    <w:p>
+      <w:pPr>
+        <w:pStyle w:val="Heading2"/>
+        <w:rPr>
+          <w:rFonts w:eastAsia="Times New Roman"/>
+          <w:lang w:val="en-NZ" w:eastAsia="en-NZ"/>
+        </w:rPr>
+      </w:pPr>
+    </w:p>
+    <w:p>
+      <w:pPr>
+        <w:pStyle w:val="Heading2"/>
+        <w:rPr>
+          <w:rFonts w:eastAsia="Times New Roman"/>
+          <w:lang w:val="en-NZ" w:eastAsia="en-NZ"/>
+        </w:rPr>
+      </w:pPr>
+    </w:p>
+    <w:p>
+      <w:pPr>
+        <w:pStyle w:val="Heading2"/>
+        <w:rPr>
+          <w:rFonts w:eastAsia="Times New Roman"/>
+          <w:lang w:val="en-NZ" w:eastAsia="en-NZ"/>
+        </w:rPr>
+      </w:pPr>
+    </w:p>
+    <w:p>
+      <w:pPr>
+        <w:rPr>
+          <w:lang w:val="en-NZ" w:eastAsia="en-NZ"/>
+        </w:rPr>
+      </w:pPr>
+    </w:p>
+    <w:p>
+      <w:pPr>
+        <w:rPr>
+          <w:lang w:val="en-NZ" w:eastAsia="en-NZ"/>
+        </w:rPr>
+      </w:pPr>
+    </w:p>
+    <w:p>
+      <w:pPr>
+        <w:pStyle w:val="Heading2"/>
+        <w:rPr>
+          <w:rFonts w:asciiTheme="minorHAnsi" w:hAnsiTheme="minorHAnsi" w:cstheme="minorHAnsi"/>
+          <w:b/>
+          <w:bCs/>
+          <w:sz w:val="28"/>
+          <w:szCs w:val="28"/>
+        </w:rPr>
+      </w:pPr>
+      <w:r>
+        <w:rPr>
+          <w:rFonts w:asciiTheme="minorHAnsi" w:hAnsiTheme="minorHAnsi" w:cstheme="minorHAnsi"/>
+          <w:b/>
+          <w:bCs/>
+          <w:sz w:val="28"/>
+          <w:szCs w:val="28"/>
         </w:rPr>
         <w:lastRenderedPageBreak/>
-        <w:t>Class</w:t>
-      </w:r>
-      <w:r>
-        <w:rPr>
-          <w:rFonts w:ascii="Arial Narrow" w:eastAsia="Times New Roman" w:hAnsi="Arial Narrow" w:cs="Segoe UI"/>
-          <w:sz w:val="24"/>
-          <w:szCs w:val="24"/>
-          <w:lang w:val="en-NZ" w:eastAsia="en-NZ"/>
-        </w:rPr>
-        <w:t xml:space="preserve"> diagram</w:t>
+        <w:t>Class diagram</w:t>
       </w:r>
       <w:bookmarkEnd w:id="15"/>
     </w:p>
     <w:p>
       <w:pPr>
+        <w:rPr>
+          <w:sz w:val="28"/>
+          <w:szCs w:val="28"/>
+          <w:lang w:val="en-NZ" w:eastAsia="en-NZ"/>
+        </w:rPr>
+      </w:pPr>
+      <w:r>
+        <w:rPr>
+          <w:sz w:val="28"/>
+          <w:szCs w:val="28"/>
+          <w:lang w:val="en-NZ" w:eastAsia="en-NZ"/>
+        </w:rPr>
+        <w:t>V1</w:t>
+      </w:r>
+    </w:p>
+    <w:p>
+      <w:pPr>
         <w:spacing w:line="259" w:lineRule="auto"/>
         <w:rPr>
-          <w:rFonts w:asciiTheme="majorHAnsi" w:eastAsia="Times New Roman" w:hAnsiTheme="majorHAnsi" w:cstheme="majorBidi"/>
-          <w:color w:val="2F5496" w:themeColor="accent1" w:themeShade="BF"/>
+          <w:rFonts w:eastAsia="Times New Roman"/>
           <w:sz w:val="44"/>
-          <w:szCs w:val="32"/>
           <w:lang w:val="en-NZ" w:eastAsia="en-NZ"/>
         </w:rPr>
       </w:pPr>
@@ -3872,7 +3988,7 @@
           <w:lang w:val="en-NZ" w:eastAsia="en-NZ"/>
         </w:rPr>
         <w:drawing>
-          <wp:inline distT="0" distB="0" distL="0" distR="0" wp14:anchorId="61EFD73B" wp14:editId="3FF8780D">
+          <wp:inline distT="0" distB="0" distL="0" distR="0" wp14:anchorId="61EFD73B" wp14:editId="6A8B5222">
             <wp:extent cx="4740348" cy="8045450"/>
             <wp:effectExtent l="0" t="0" r="3175" b="0"/>
             <wp:docPr id="531836629" name="Picture 1" descr="A screenshot of a computer&#10;&#10;AI-generated content may be incorrect."/>
@@ -3901,7 +4017,7 @@
                   <pic:spPr>
                     <a:xfrm>
                       <a:off x="0" y="0"/>
-                      <a:ext cx="4742934" cy="8049839"/>
+                      <a:ext cx="4740348" cy="8045450"/>
                     </a:xfrm>
                     <a:prstGeom prst="rect">
                       <a:avLst/>
@@ -3924,213 +4040,21 @@
     </w:p>
     <w:p>
       <w:pPr>
-        <w:pStyle w:val="Heading1"/>
-        <w:rPr>
-          <w:rFonts w:ascii="Arial Narrow" w:eastAsia="Times New Roman" w:hAnsi="Arial Narrow" w:cs="Segoe UI"/>
-          <w:sz w:val="24"/>
-          <w:szCs w:val="24"/>
-          <w:lang w:val="en-NZ" w:eastAsia="en-NZ"/>
-        </w:rPr>
-      </w:pPr>
-      <w:bookmarkStart w:id="16" w:name="_Toc141881223"/>
-      <w:r>
-        <w:rPr>
-          <w:rFonts w:eastAsia="Times New Roman"/>
-          <w:sz w:val="44"/>
+        <w:rPr>
+          <w:sz w:val="28"/>
+          <w:szCs w:val="28"/>
+          <w:lang w:val="en-NZ" w:eastAsia="en-NZ"/>
+        </w:rPr>
+      </w:pPr>
+      <w:r>
+        <w:rPr>
+          <w:sz w:val="28"/>
+          <w:szCs w:val="28"/>
           <w:lang w:val="en-NZ" w:eastAsia="en-NZ"/>
         </w:rPr>
         <w:lastRenderedPageBreak/>
-        <w:t>Development</w:t>
-      </w:r>
-      <w:bookmarkEnd w:id="16"/>
-      <w:r>
-        <w:rPr>
-          <w:rFonts w:ascii="Arial Narrow" w:eastAsia="Times New Roman" w:hAnsi="Arial Narrow" w:cs="Segoe UI"/>
-          <w:sz w:val="24"/>
-          <w:szCs w:val="24"/>
-          <w:lang w:val="en-NZ" w:eastAsia="en-NZ"/>
-        </w:rPr>
-        <w:t xml:space="preserve"> </w:t>
-      </w:r>
-    </w:p>
-    <w:p>
-      <w:pPr>
-        <w:pStyle w:val="Heading2"/>
-        <w:rPr>
-          <w:rFonts w:ascii="Arial Narrow" w:eastAsia="Times New Roman" w:hAnsi="Arial Narrow" w:cs="Segoe UI"/>
-          <w:sz w:val="24"/>
-          <w:szCs w:val="24"/>
-          <w:lang w:val="en-NZ" w:eastAsia="en-NZ"/>
-        </w:rPr>
-      </w:pPr>
-      <w:bookmarkStart w:id="17" w:name="_Toc141881224"/>
-      <w:r>
-        <w:rPr>
-          <w:rFonts w:eastAsia="Times New Roman"/>
-          <w:lang w:val="en-NZ" w:eastAsia="en-NZ"/>
-        </w:rPr>
-        <w:t>GitHub</w:t>
-      </w:r>
-      <w:r>
-        <w:rPr>
-          <w:rFonts w:ascii="Arial Narrow" w:eastAsia="Times New Roman" w:hAnsi="Arial Narrow" w:cs="Segoe UI"/>
-          <w:sz w:val="24"/>
-          <w:szCs w:val="24"/>
-          <w:lang w:val="en-NZ" w:eastAsia="en-NZ"/>
-        </w:rPr>
-        <w:t xml:space="preserve"> commits</w:t>
-      </w:r>
-      <w:bookmarkEnd w:id="17"/>
-    </w:p>
-    <w:p>
-      <w:pPr>
-        <w:rPr>
-          <w:lang w:val="en-NZ" w:eastAsia="en-NZ"/>
-        </w:rPr>
-      </w:pPr>
-    </w:p>
-    <w:p>
-      <w:pPr>
-        <w:rPr>
-          <w:lang w:val="en-NZ" w:eastAsia="en-NZ"/>
-        </w:rPr>
-      </w:pPr>
-    </w:p>
-    <w:p>
-      <w:pPr>
-        <w:pStyle w:val="Heading2"/>
-        <w:rPr>
-          <w:rFonts w:ascii="Arial Narrow" w:eastAsia="Times New Roman" w:hAnsi="Arial Narrow" w:cs="Segoe UI"/>
-          <w:sz w:val="24"/>
-          <w:szCs w:val="24"/>
-          <w:lang w:val="en-NZ" w:eastAsia="en-NZ"/>
-        </w:rPr>
-      </w:pPr>
-      <w:bookmarkStart w:id="18" w:name="_Toc141881225"/>
-      <w:r>
-        <w:rPr>
-          <w:rFonts w:eastAsia="Times New Roman"/>
-          <w:lang w:val="en-NZ" w:eastAsia="en-NZ"/>
-        </w:rPr>
-        <w:t>Screen</w:t>
-      </w:r>
-      <w:r>
-        <w:rPr>
-          <w:rFonts w:ascii="Arial Narrow" w:eastAsia="Times New Roman" w:hAnsi="Arial Narrow" w:cs="Segoe UI"/>
-          <w:sz w:val="24"/>
-          <w:szCs w:val="24"/>
-          <w:lang w:val="en-NZ" w:eastAsia="en-NZ"/>
-        </w:rPr>
-        <w:t xml:space="preserve"> shots</w:t>
-      </w:r>
-      <w:bookmarkEnd w:id="18"/>
-    </w:p>
-    <w:p>
-      <w:pPr>
-        <w:rPr>
-          <w:lang w:val="en-NZ" w:eastAsia="en-NZ"/>
-        </w:rPr>
-      </w:pPr>
-    </w:p>
-    <w:p>
-      <w:pPr>
-        <w:rPr>
-          <w:lang w:val="en-NZ" w:eastAsia="en-NZ"/>
-        </w:rPr>
-      </w:pPr>
-    </w:p>
-    <w:p>
-      <w:pPr>
-        <w:rPr>
-          <w:lang w:val="en-NZ" w:eastAsia="en-NZ"/>
-        </w:rPr>
-      </w:pPr>
-    </w:p>
-    <w:p>
-      <w:pPr>
-        <w:pStyle w:val="Heading2"/>
-        <w:rPr>
-          <w:rFonts w:ascii="Arial Narrow" w:eastAsia="Times New Roman" w:hAnsi="Arial Narrow" w:cs="Segoe UI"/>
-          <w:sz w:val="24"/>
-          <w:szCs w:val="24"/>
-          <w:lang w:val="en-NZ" w:eastAsia="en-NZ"/>
-        </w:rPr>
-      </w:pPr>
-      <w:bookmarkStart w:id="19" w:name="_Toc141881226"/>
-      <w:r>
-        <w:rPr>
-          <w:rFonts w:eastAsia="Times New Roman"/>
-          <w:lang w:val="en-NZ" w:eastAsia="en-NZ"/>
-        </w:rPr>
-        <w:t>Code</w:t>
-      </w:r>
-      <w:r>
-        <w:rPr>
-          <w:rFonts w:ascii="Arial Narrow" w:eastAsia="Times New Roman" w:hAnsi="Arial Narrow" w:cs="Segoe UI"/>
-          <w:sz w:val="24"/>
-          <w:szCs w:val="24"/>
-          <w:lang w:val="en-NZ" w:eastAsia="en-NZ"/>
-        </w:rPr>
-        <w:t xml:space="preserve"> comments and descriptions</w:t>
-      </w:r>
-      <w:bookmarkEnd w:id="19"/>
-    </w:p>
-    <w:p>
-      <w:pPr>
-        <w:rPr>
-          <w:lang w:val="en-NZ" w:eastAsia="en-NZ"/>
-        </w:rPr>
-      </w:pPr>
-    </w:p>
-    <w:p>
-      <w:pPr>
-        <w:rPr>
-          <w:lang w:val="en-NZ" w:eastAsia="en-NZ"/>
-        </w:rPr>
-      </w:pPr>
-    </w:p>
-    <w:p>
-      <w:pPr>
-        <w:rPr>
-          <w:lang w:val="en-NZ" w:eastAsia="en-NZ"/>
-        </w:rPr>
-      </w:pPr>
-    </w:p>
-    <w:p>
-      <w:pPr>
-        <w:pStyle w:val="Heading2"/>
-        <w:rPr>
-          <w:rFonts w:ascii="Arial Narrow" w:eastAsia="Times New Roman" w:hAnsi="Arial Narrow" w:cs="Segoe UI"/>
-          <w:sz w:val="24"/>
-          <w:szCs w:val="24"/>
-          <w:lang w:val="en-NZ" w:eastAsia="en-NZ"/>
-        </w:rPr>
-      </w:pPr>
-      <w:bookmarkStart w:id="20" w:name="_Toc141881227"/>
-      <w:r>
-        <w:rPr>
-          <w:rFonts w:eastAsia="Times New Roman"/>
-          <w:lang w:val="en-NZ" w:eastAsia="en-NZ"/>
-        </w:rPr>
-        <w:t>Development</w:t>
-      </w:r>
-      <w:r>
-        <w:rPr>
-          <w:rFonts w:ascii="Arial Narrow" w:eastAsia="Times New Roman" w:hAnsi="Arial Narrow" w:cs="Segoe UI"/>
-          <w:sz w:val="24"/>
-          <w:szCs w:val="24"/>
-          <w:lang w:val="en-NZ" w:eastAsia="en-NZ"/>
-        </w:rPr>
-        <w:t xml:space="preserve"> stages - progress made should be visible</w:t>
-      </w:r>
-      <w:bookmarkEnd w:id="20"/>
-    </w:p>
-    <w:p>
-      <w:pPr>
-        <w:rPr>
-          <w:lang w:val="en-NZ" w:eastAsia="en-NZ"/>
-        </w:rPr>
-      </w:pPr>
+        <w:t>V2</w:t>
+      </w:r>
     </w:p>
     <w:p>
       <w:pPr>
@@ -4143,6 +4067,260 @@
           <w:lang w:val="en-NZ" w:eastAsia="en-NZ"/>
         </w:rPr>
       </w:pPr>
+    </w:p>
+    <w:p>
+      <w:pPr>
+        <w:pStyle w:val="Heading1"/>
+        <w:rPr>
+          <w:rFonts w:ascii="Arial Narrow" w:eastAsia="Times New Roman" w:hAnsi="Arial Narrow" w:cs="Segoe UI"/>
+          <w:sz w:val="24"/>
+          <w:szCs w:val="24"/>
+          <w:lang w:val="en-NZ" w:eastAsia="en-NZ"/>
+        </w:rPr>
+      </w:pPr>
+      <w:bookmarkStart w:id="16" w:name="_Toc141881223"/>
+      <w:r>
+        <w:rPr>
+          <w:rFonts w:eastAsia="Times New Roman"/>
+          <w:sz w:val="44"/>
+          <w:lang w:val="en-NZ" w:eastAsia="en-NZ"/>
+        </w:rPr>
+        <w:t>Development</w:t>
+      </w:r>
+      <w:bookmarkEnd w:id="16"/>
+      <w:r>
+        <w:rPr>
+          <w:rFonts w:ascii="Arial Narrow" w:eastAsia="Times New Roman" w:hAnsi="Arial Narrow" w:cs="Segoe UI"/>
+          <w:sz w:val="24"/>
+          <w:szCs w:val="24"/>
+          <w:lang w:val="en-NZ" w:eastAsia="en-NZ"/>
+        </w:rPr>
+        <w:t xml:space="preserve"> </w:t>
+      </w:r>
+    </w:p>
+    <w:p>
+      <w:pPr>
+        <w:pStyle w:val="Heading2"/>
+        <w:rPr>
+          <w:rFonts w:ascii="Arial Narrow" w:eastAsia="Times New Roman" w:hAnsi="Arial Narrow" w:cs="Segoe UI"/>
+          <w:sz w:val="24"/>
+          <w:szCs w:val="24"/>
+          <w:lang w:val="en-NZ" w:eastAsia="en-NZ"/>
+        </w:rPr>
+      </w:pPr>
+      <w:bookmarkStart w:id="17" w:name="_Toc141881224"/>
+      <w:r>
+        <w:rPr>
+          <w:rFonts w:asciiTheme="minorHAnsi" w:hAnsiTheme="minorHAnsi" w:cstheme="minorHAnsi"/>
+          <w:b/>
+          <w:bCs/>
+          <w:sz w:val="28"/>
+          <w:szCs w:val="28"/>
+        </w:rPr>
+        <w:t xml:space="preserve">GitHub </w:t>
+      </w:r>
+      <w:proofErr w:type="gramStart"/>
+      <w:r>
+        <w:rPr>
+          <w:rFonts w:asciiTheme="minorHAnsi" w:hAnsiTheme="minorHAnsi" w:cstheme="minorHAnsi"/>
+          <w:b/>
+          <w:bCs/>
+          <w:sz w:val="28"/>
+          <w:szCs w:val="28"/>
+        </w:rPr>
+        <w:t>commits</w:t>
+      </w:r>
+      <w:bookmarkEnd w:id="17"/>
+      <w:proofErr w:type="gramEnd"/>
+    </w:p>
+    <w:p>
+      <w:pPr>
+        <w:rPr>
+          <w:lang w:val="en-NZ" w:eastAsia="en-NZ"/>
+        </w:rPr>
+      </w:pPr>
+    </w:p>
+    <w:p>
+      <w:pPr>
+        <w:rPr>
+          <w:lang w:val="en-NZ" w:eastAsia="en-NZ"/>
+        </w:rPr>
+      </w:pPr>
+    </w:p>
+    <w:p>
+      <w:pPr>
+        <w:pStyle w:val="Heading2"/>
+        <w:rPr>
+          <w:rFonts w:asciiTheme="minorHAnsi" w:hAnsiTheme="minorHAnsi" w:cstheme="minorHAnsi"/>
+          <w:b/>
+          <w:bCs/>
+          <w:sz w:val="28"/>
+          <w:szCs w:val="28"/>
+        </w:rPr>
+      </w:pPr>
+      <w:bookmarkStart w:id="18" w:name="_Toc141881225"/>
+      <w:r>
+        <w:rPr>
+          <w:rFonts w:asciiTheme="minorHAnsi" w:hAnsiTheme="minorHAnsi" w:cstheme="minorHAnsi"/>
+          <w:b/>
+          <w:bCs/>
+          <w:sz w:val="28"/>
+          <w:szCs w:val="28"/>
+        </w:rPr>
+        <w:t>Scree</w:t>
+      </w:r>
+      <w:r>
+        <w:rPr>
+          <w:rFonts w:asciiTheme="minorHAnsi" w:hAnsiTheme="minorHAnsi" w:cstheme="minorHAnsi"/>
+          <w:b/>
+          <w:bCs/>
+          <w:sz w:val="28"/>
+          <w:szCs w:val="28"/>
+        </w:rPr>
+        <w:t>n</w:t>
+      </w:r>
+      <w:r>
+        <w:rPr>
+          <w:rFonts w:asciiTheme="minorHAnsi" w:hAnsiTheme="minorHAnsi" w:cstheme="minorHAnsi"/>
+          <w:b/>
+          <w:bCs/>
+          <w:sz w:val="28"/>
+          <w:szCs w:val="28"/>
+        </w:rPr>
+        <w:t>shots</w:t>
+      </w:r>
+      <w:bookmarkEnd w:id="18"/>
+    </w:p>
+    <w:p>
+      <w:pPr>
+        <w:rPr>
+          <w:lang w:val="en-NZ" w:eastAsia="en-NZ"/>
+        </w:rPr>
+      </w:pPr>
+    </w:p>
+    <w:p>
+      <w:pPr>
+        <w:rPr>
+          <w:lang w:val="en-NZ" w:eastAsia="en-NZ"/>
+        </w:rPr>
+      </w:pPr>
+    </w:p>
+    <w:p>
+      <w:pPr>
+        <w:rPr>
+          <w:lang w:val="en-NZ" w:eastAsia="en-NZ"/>
+        </w:rPr>
+      </w:pPr>
+    </w:p>
+    <w:p>
+      <w:pPr>
+        <w:pStyle w:val="Heading2"/>
+        <w:rPr>
+          <w:rFonts w:ascii="Arial Narrow" w:eastAsia="Times New Roman" w:hAnsi="Arial Narrow" w:cs="Segoe UI"/>
+          <w:sz w:val="24"/>
+          <w:szCs w:val="24"/>
+          <w:lang w:val="en-NZ" w:eastAsia="en-NZ"/>
+        </w:rPr>
+      </w:pPr>
+      <w:bookmarkStart w:id="19" w:name="_Toc141881226"/>
+      <w:r>
+        <w:rPr>
+          <w:rFonts w:asciiTheme="minorHAnsi" w:hAnsiTheme="minorHAnsi" w:cstheme="minorHAnsi"/>
+          <w:b/>
+          <w:bCs/>
+          <w:sz w:val="28"/>
+          <w:szCs w:val="28"/>
+        </w:rPr>
+        <w:t xml:space="preserve">Code comments and </w:t>
+      </w:r>
+      <w:proofErr w:type="gramStart"/>
+      <w:r>
+        <w:rPr>
+          <w:rFonts w:asciiTheme="minorHAnsi" w:hAnsiTheme="minorHAnsi" w:cstheme="minorHAnsi"/>
+          <w:b/>
+          <w:bCs/>
+          <w:sz w:val="28"/>
+          <w:szCs w:val="28"/>
+        </w:rPr>
+        <w:t>descriptions</w:t>
+      </w:r>
+      <w:bookmarkEnd w:id="19"/>
+      <w:proofErr w:type="gramEnd"/>
+    </w:p>
+    <w:p>
+      <w:pPr>
+        <w:rPr>
+          <w:lang w:val="en-NZ" w:eastAsia="en-NZ"/>
+        </w:rPr>
+      </w:pPr>
+    </w:p>
+    <w:p>
+      <w:pPr>
+        <w:rPr>
+          <w:lang w:val="en-NZ" w:eastAsia="en-NZ"/>
+        </w:rPr>
+      </w:pPr>
+    </w:p>
+    <w:p>
+      <w:pPr>
+        <w:rPr>
+          <w:lang w:val="en-NZ" w:eastAsia="en-NZ"/>
+        </w:rPr>
+      </w:pPr>
+    </w:p>
+    <w:p>
+      <w:pPr>
+        <w:pStyle w:val="Heading2"/>
+        <w:rPr>
+          <w:rFonts w:ascii="Arial Narrow" w:eastAsia="Times New Roman" w:hAnsi="Arial Narrow" w:cs="Segoe UI"/>
+          <w:sz w:val="24"/>
+          <w:szCs w:val="24"/>
+          <w:lang w:val="en-NZ" w:eastAsia="en-NZ"/>
+        </w:rPr>
+      </w:pPr>
+      <w:bookmarkStart w:id="20" w:name="_Toc141881227"/>
+      <w:r>
+        <w:rPr>
+          <w:rFonts w:asciiTheme="minorHAnsi" w:hAnsiTheme="minorHAnsi" w:cstheme="minorHAnsi"/>
+          <w:b/>
+          <w:bCs/>
+          <w:sz w:val="28"/>
+          <w:szCs w:val="28"/>
+        </w:rPr>
+        <w:t xml:space="preserve">Development stages - progress made should be </w:t>
+      </w:r>
+      <w:proofErr w:type="gramStart"/>
+      <w:r>
+        <w:rPr>
+          <w:rFonts w:asciiTheme="minorHAnsi" w:hAnsiTheme="minorHAnsi" w:cstheme="minorHAnsi"/>
+          <w:b/>
+          <w:bCs/>
+          <w:sz w:val="28"/>
+          <w:szCs w:val="28"/>
+        </w:rPr>
+        <w:t>visible</w:t>
+      </w:r>
+      <w:bookmarkEnd w:id="20"/>
+      <w:proofErr w:type="gramEnd"/>
+    </w:p>
+    <w:p>
+      <w:pPr>
+        <w:rPr>
+          <w:lang w:val="en-NZ" w:eastAsia="en-NZ"/>
+        </w:rPr>
+      </w:pPr>
+    </w:p>
+    <w:p>
+      <w:pPr>
+        <w:spacing w:line="259" w:lineRule="auto"/>
+        <w:rPr>
+          <w:rFonts w:asciiTheme="majorHAnsi" w:eastAsia="Times New Roman" w:hAnsiTheme="majorHAnsi" w:cstheme="majorBidi"/>
+          <w:color w:val="2F5496" w:themeColor="accent1" w:themeShade="BF"/>
+          <w:sz w:val="44"/>
+          <w:szCs w:val="32"/>
+          <w:lang w:val="en-NZ" w:eastAsia="en-NZ"/>
+        </w:rPr>
+      </w:pPr>
       <w:r>
         <w:rPr>
           <w:rFonts w:eastAsia="Times New Roman"/>
@@ -4327,9 +4505,19 @@
           <w:color w:val="2F5496" w:themeColor="accent1" w:themeShade="BF"/>
           <w:lang w:val="en-NZ" w:eastAsia="en-NZ"/>
         </w:rPr>
-        <w:t>Test cases - check all options, boundary cases and error control/message</w:t>
+        <w:t>Test cases - check all options, boundary cases and error control/</w:t>
+      </w:r>
+      <w:proofErr w:type="gramStart"/>
+      <w:r>
+        <w:rPr>
+          <w:rFonts w:eastAsia="Times New Roman"/>
+          <w:color w:val="2F5496" w:themeColor="accent1" w:themeShade="BF"/>
+          <w:lang w:val="en-NZ" w:eastAsia="en-NZ"/>
+        </w:rPr>
+        <w:t>message</w:t>
       </w:r>
       <w:bookmarkEnd w:id="24"/>
+      <w:proofErr w:type="gramEnd"/>
     </w:p>
     <w:p>
       <w:pPr>
@@ -4575,8 +4763,17 @@
           <w:rFonts w:eastAsia="Times New Roman"/>
           <w:lang w:val="en-NZ" w:eastAsia="en-NZ"/>
         </w:rPr>
-        <w:t xml:space="preserve"> directions - explain what was planned and whether it was achieved or not, if not then what can be done in future to improve the software</w:t>
-      </w:r>
+        <w:t xml:space="preserve"> directions - explain what was planned and whether it was achieved or not, if not then what can be done in future to improve the </w:t>
+      </w:r>
+      <w:proofErr w:type="gramStart"/>
+      <w:r>
+        <w:rPr>
+          <w:rFonts w:eastAsia="Times New Roman"/>
+          <w:lang w:val="en-NZ" w:eastAsia="en-NZ"/>
+        </w:rPr>
+        <w:t>software</w:t>
+      </w:r>
+      <w:proofErr w:type="gramEnd"/>
     </w:p>
     <w:p>
       <w:pPr>

</xml_diff>